<commit_message>
Respuesta a la revisión del protocolo y práctica «Cuida tus cuentas» (contraseñas y verificación en dos pasos)
Co-Authored-By: Claude Opus 5.5 <noreply@anthropic.com>
Claude-Session: https://claude.ai/code/session_01RGcBUDV4jzek46kGUnkCyb
</commit_message>
<xml_diff>
--- a/docs/Protocolo-Testeo-PMV-Proyecto24-v2.docx
+++ b/docs/Protocolo-Testeo-PMV-Proyecto24-v2.docx
@@ -857,7 +857,7 @@
         <w:t xml:space="preserve">[número]</w:t>
       </w:r>
       <w:r>
-        <w:t xml:space="preserve"> uniformados del GAULA, visitan los locales de las cuadras piloto y desarrollan un taller de 60 minutos con la agenda del anexo F: prueba de entrada, explicación del kit, simulacro en el simulador, uso del bot, prueba de salida y cierre explicativo.</w:t>
+        <w:t xml:space="preserve"> uniformados del GAULA, visitan los locales de las cuadras piloto y desarrollan un taller de 60 minutos con la agenda del anexo F: prueba de entrada, explicación del kit, un bloque sobre contraseñas robustas y verificación en dos pasos, simulacro en el simulador, uso del bot, prueba de salida y cierre explicativo.</w:t>
       </w:r>
     </w:p>
     <w:p>
@@ -5566,6 +5566,87 @@
             </w:pPr>
             <w:r>
               <w:t xml:space="preserve">6 ítems (anexo C)</w:t>
+            </w:r>
+          </w:p>
+        </w:tc>
+        <w:tc>
+          <w:tcPr>
+            <w:tcW w:type="dxa" w:w="1324"/>
+            <w:tcMar>
+              <w:top w:type="dxa" w:w="60"/>
+              <w:left w:type="dxa" w:w="100"/>
+              <w:bottom w:type="dxa" w:w="60"/>
+              <w:right w:type="dxa" w:w="100"/>
+            </w:tcMar>
+          </w:tcPr>
+          <w:p>
+            <w:pPr>
+              <w:spacing w:after="40"/>
+            </w:pPr>
+            <w:r>
+              <w:t xml:space="preserve">Complementario</w:t>
+            </w:r>
+          </w:p>
+        </w:tc>
+      </w:tr>
+      <w:tr>
+        <w:trPr>
+          <w:cantSplit/>
+        </w:trPr>
+        <w:tc>
+          <w:tcPr>
+            <w:tcW w:type="dxa" w:w="2835"/>
+            <w:tcMar>
+              <w:top w:type="dxa" w:w="60"/>
+              <w:left w:type="dxa" w:w="100"/>
+              <w:bottom w:type="dxa" w:w="60"/>
+              <w:right w:type="dxa" w:w="100"/>
+            </w:tcMar>
+          </w:tcPr>
+          <w:p>
+            <w:pPr>
+              <w:spacing w:after="40"/>
+            </w:pPr>
+            <w:r>
+              <w:t xml:space="preserve">Práctica «Cuida tus cuentas»</w:t>
+            </w:r>
+          </w:p>
+        </w:tc>
+        <w:tc>
+          <w:tcPr>
+            <w:tcW w:type="dxa" w:w="2835"/>
+            <w:tcMar>
+              <w:top w:type="dxa" w:w="60"/>
+              <w:left w:type="dxa" w:w="100"/>
+              <w:bottom w:type="dxa" w:w="60"/>
+              <w:right w:type="dxa" w:w="100"/>
+            </w:tcMar>
+          </w:tcPr>
+          <w:p>
+            <w:pPr>
+              <w:spacing w:after="40"/>
+            </w:pPr>
+            <w:r>
+              <w:t xml:space="preserve">Conocimiento sobre contraseñas y verificación en dos pasos</w:t>
+            </w:r>
+          </w:p>
+        </w:tc>
+        <w:tc>
+          <w:tcPr>
+            <w:tcW w:type="dxa" w:w="2646"/>
+            <w:tcMar>
+              <w:top w:type="dxa" w:w="60"/>
+              <w:left w:type="dxa" w:w="100"/>
+              <w:bottom w:type="dxa" w:w="60"/>
+              <w:right w:type="dxa" w:w="100"/>
+            </w:tcMar>
+          </w:tcPr>
+          <w:p>
+            <w:pPr>
+              <w:spacing w:after="40"/>
+            </w:pPr>
+            <w:r>
+              <w:t xml:space="preserve">5 preguntas en el aula virtual (opcional)</w:t>
             </w:r>
           </w:p>
         </w:tc>
@@ -12440,7 +12521,7 @@
               <w:spacing w:after="40"/>
             </w:pPr>
             <w:r>
-              <w:t xml:space="preserve">10–25</w:t>
+              <w:t xml:space="preserve">10–21</w:t>
             </w:r>
           </w:p>
         </w:tc>
@@ -12479,6 +12560,68 @@
             </w:pPr>
             <w:r>
               <w:t xml:space="preserve">Kit impreso; página de inicio</w:t>
+            </w:r>
+          </w:p>
+        </w:tc>
+      </w:tr>
+      <w:tr>
+        <w:trPr>
+          <w:cantSplit/>
+        </w:trPr>
+        <w:tc>
+          <w:tcPr>
+            <w:tcW w:type="dxa" w:w="1157"/>
+            <w:tcMar>
+              <w:top w:type="dxa" w:w="60"/>
+              <w:left w:type="dxa" w:w="100"/>
+              <w:bottom w:type="dxa" w:w="60"/>
+              <w:right w:type="dxa" w:w="100"/>
+            </w:tcMar>
+          </w:tcPr>
+          <w:p>
+            <w:pPr>
+              <w:spacing w:after="40"/>
+            </w:pPr>
+            <w:r>
+              <w:t xml:space="preserve">21–25</w:t>
+            </w:r>
+          </w:p>
+        </w:tc>
+        <w:tc>
+          <w:tcPr>
+            <w:tcW w:type="dxa" w:w="5784"/>
+            <w:tcMar>
+              <w:top w:type="dxa" w:w="60"/>
+              <w:left w:type="dxa" w:w="100"/>
+              <w:bottom w:type="dxa" w:w="60"/>
+              <w:right w:type="dxa" w:w="100"/>
+            </w:tcMar>
+          </w:tcPr>
+          <w:p>
+            <w:pPr>
+              <w:spacing w:after="40"/>
+            </w:pPr>
+            <w:r>
+              <w:t xml:space="preserve">Cuida tus cuentas: contraseñas robustas y activación de la verificación en dos pasos en WhatsApp y en la app del banco, con el celular del participante si lo desea.</w:t>
+            </w:r>
+          </w:p>
+        </w:tc>
+        <w:tc>
+          <w:tcPr>
+            <w:tcW w:type="dxa" w:w="2699"/>
+            <w:tcMar>
+              <w:top w:type="dxa" w:w="60"/>
+              <w:left w:type="dxa" w:w="100"/>
+              <w:bottom w:type="dxa" w:w="60"/>
+              <w:right w:type="dxa" w:w="100"/>
+            </w:tcMar>
+          </w:tcPr>
+          <w:p>
+            <w:pPr>
+              <w:spacing w:after="40"/>
+            </w:pPr>
+            <w:r>
+              <w:t xml:space="preserve">Práctica «Cuida tus cuentas» del aula virtual</w:t>
             </w:r>
           </w:p>
         </w:tc>

</xml_diff>